<commit_message>
Corrige shading do cabeçalho da tabela no resumo de 1 página (w:shd sem w:val)
Co-Authored-By: Claude Fable 5 <noreply@anthropic.com>
Claude-Session: https://claude.ai/code/session_01DqEaERD1LDFtugtNrL73cp
</commit_message>
<xml_diff>
--- a/Resumo_Jazida_Perguntas_CIPREM.docx
+++ b/Resumo_Jazida_Perguntas_CIPREM.docx
@@ -213,7 +213,7 @@
               <w:bottom w:val="single" w:color="BBBBBB" w:sz="4"/>
               <w:right w:val="single" w:color="BBBBBB" w:sz="4"/>
             </w:tcBorders>
-            <w:shd w:fill="1F3B5C"/>
+            <w:shd w:fill="1F3B5C" w:color="auto" w:val="clear"/>
             <w:tcMar>
               <w:top w:type="dxa" w:w="40"/>
               <w:left w:type="dxa" w:w="80"/>
@@ -248,7 +248,7 @@
               <w:bottom w:val="single" w:color="BBBBBB" w:sz="4"/>
               <w:right w:val="single" w:color="BBBBBB" w:sz="4"/>
             </w:tcBorders>
-            <w:shd w:fill="1F3B5C"/>
+            <w:shd w:fill="1F3B5C" w:color="auto" w:val="clear"/>
             <w:tcMar>
               <w:top w:type="dxa" w:w="40"/>
               <w:left w:type="dxa" w:w="80"/>
@@ -283,7 +283,7 @@
               <w:bottom w:val="single" w:color="BBBBBB" w:sz="4"/>
               <w:right w:val="single" w:color="BBBBBB" w:sz="4"/>
             </w:tcBorders>
-            <w:shd w:fill="1F3B5C"/>
+            <w:shd w:fill="1F3B5C" w:color="auto" w:val="clear"/>
             <w:tcMar>
               <w:top w:type="dxa" w:w="40"/>
               <w:left w:type="dxa" w:w="80"/>

</xml_diff>

<commit_message>
Incorpora consultas oficiais ANM/SCM (05/08/2026): RFP aprovado e correção do 896.516
- 896.059/2012 (mãe, 48,4 ha): CIPREM titular, Requerimento de Lavra ativo,
  RFP APROVADO em 07/08/2017 (439,08→97,22 ha, granito) — rota B confirmada
- 896.624/2013: Licenciamento ativo, Registro 8/2021, GRANITO-Brita, RAL 2024-26 em dia
- 896.569/2013: arquivado regularmente (virou o licenciamento em 18/05/2021)
- 896.516/2012: CORREÇÃO — titular é Ecoareia (563 ha), não CIPREM; rota D
  passa a ser a concessão nos 48,4 ha próprios do 896.059
- producao_maxima §5/§6 atualizados; resumo da gerente (perguntas 2 e 5) refeito
- 4 fichas SCM arquivadas em consultas_anm/

Co-Authored-By: Claude Fable 5 <noreply@anthropic.com>
Claude-Session: https://claude.ai/code/session_01DqEaERD1LDFtugtNrL73cp
</commit_message>
<xml_diff>
--- a/Resumo_Jazida_Perguntas_CIPREM.docx
+++ b/Resumo_Jazida_Perguntas_CIPREM.docx
@@ -167,7 +167,25 @@
           <w:sz w:val="19"/>
           <w:szCs w:val="19"/>
         </w:rPr>
-        <w:t xml:space="preserve">. O banco cruza reserva comprovada × prazo do contrato. A rocha muito provavelmente existe; o que falta é o documento que comprove — e os itens 1 e 2 abaixo resolvem isso de forma rápida e barata, virando argumento a favor do pleito.</w:t>
+        <w:t xml:space="preserve">. O banco cruza reserva comprovada × prazo do contrato. Boa notícia já confirmada na ANM (consulta oficial de 05/08/2026): o Relatório Final de Pesquisa do maciço foi </w:t>
+      </w:r>
+      <w:r>
+        <w:rPr>
+          <w:rFonts w:ascii="Trebuchet MS" w:cs="Trebuchet MS" w:eastAsia="Trebuchet MS" w:hAnsi="Trebuchet MS"/>
+          <w:b/>
+          <w:bCs/>
+          <w:sz w:val="19"/>
+          <w:szCs w:val="19"/>
+        </w:rPr>
+        <w:t xml:space="preserve">aprovado em 07/08/2017</w:t>
+      </w:r>
+      <w:r>
+        <w:rPr>
+          <w:rFonts w:ascii="Trebuchet MS" w:cs="Trebuchet MS" w:eastAsia="Trebuchet MS" w:hAnsi="Trebuchet MS"/>
+          <w:sz w:val="19"/>
+          <w:szCs w:val="19"/>
+        </w:rPr>
+        <w:t xml:space="preserve"> e a CIPREM é titular do processo — falta apenas obter a cópia (item 2) e, em paralelo, a sondagem (item 1). Resolver isso vira argumento a favor do pleito.</w:t>
       </w:r>
     </w:p>
     <w:p>
@@ -459,7 +477,7 @@
                 <w:sz w:val="19"/>
                 <w:szCs w:val="19"/>
               </w:rPr>
-              <w:t xml:space="preserve">RFP do processo-mãe 896.059/2012 (custo ~zero): temos cópia do Relatório Final de Pesquisa aprovado na ANM? A fase atual do processo (Requerimento de Lavra) pressupõe RFP aprovado nos autos. Se ninguém tiver, autorizam pedir cópia via SEI-ANM? Tende a fechar sozinho a folga dos 14 anos.</w:t>
+              <w:t xml:space="preserve">Cópia do RFP: a ANM APROVOU o Relatório Final de Pesquisa do processo-mãe 896.059/2012 em 07/08/2017 (97,22 ha de granito — confirmado na consulta oficial de 05/08/2026). Quem tem a cópia? O consultor mineral (os autos registram vários pedidos de vista/cópia por procurador)? Se ninguém tiver, autorizam pedir via SEI-ANM? Custo ~zero; tende a fechar a folga dos 14 anos.</w:t>
             </w:r>
           </w:p>
         </w:tc>
@@ -641,7 +659,7 @@
                 <w:sz w:val="19"/>
                 <w:szCs w:val="19"/>
               </w:rPr>
-              <w:t xml:space="preserve">Ampliação futura da licença (ritmo): quando as vendas sustentarem ~70% do teto, iniciamos a ampliação de 8.000 para até 12.097 m³/mês (+51%, mantém o porte; processo de 12–24 meses no IEMA/ANM)?</w:t>
+              <w:t xml:space="preserve">Ampliação futura da licença (ritmo): quando as vendas sustentarem ~70% do teto, iniciamos a ampliação de 8.000 para até ~12.100 m³/mês (+51%, mantém o porte; processo de 12–24 meses no IEMA/ANM)?</w:t>
             </w:r>
           </w:p>
         </w:tc>
@@ -732,7 +750,7 @@
                 <w:sz w:val="19"/>
                 <w:szCs w:val="19"/>
               </w:rPr>
-              <w:t xml:space="preserve">Áreas vizinhas: qual a fase real do processo 896.516/2012 (~58 ha, em nome da CIPREM)? E as áreas mapeadas (Faz. Alvorada II e “área Marchiori”) — vale iniciar o licenciamento de uma segunda frente?</w:t>
+              <w:t xml:space="preserve">Segunda frente: o próprio 896.059/2012 — 48,4 ha contíguos da CIPREM, em Requerimento de Lavra desde 07/08/2018 (parado na ANM desde 2020) — como pretendem conduzi-lo (pedido de andamento, PAE de lavra, licenciamento)? Obs.: o processo 896.516/2012, citado no documento interno como da CIPREM (~58 ha), na verdade pertence à Ecoareia Comércio de Areia Ltda (563 ha) — o que o documento quis dizer? Há negociação com a Ecoareia? E as áreas Faz. Alvorada II e “Marchiori”?</w:t>
             </w:r>
           </w:p>
         </w:tc>
@@ -823,7 +841,7 @@
                 <w:sz w:val="19"/>
                 <w:szCs w:val="19"/>
               </w:rPr>
-              <w:t xml:space="preserve">Renovação: quem cuidará da renovação do Registro de Licença nº 8/2021, que vence em 31/08/2029 — no meio do prazo do financiamento?</w:t>
+              <w:t xml:space="preserve">Renovação: quem cuidará da renovação do Registro de Licença nº 8/2021, que vence em 31/08/2029 — no meio do prazo do financiamento? (Ponto positivo já confirmado: RAL 2024, 2025 e 2026 apresentados em dia.)</w:t>
             </w:r>
           </w:p>
         </w:tc>

</xml_diff>